<commit_message>
Update README and DOCUMENTATION.docx for the new lead discovery pipeline
</commit_message>
<xml_diff>
--- a/DOCUMENTATION.docx
+++ b/DOCUMENTATION.docx
@@ -829,6 +829,196 @@
         </w:tc>
       </w:tr>
     </w:tbl>
+    <w:p>
+      <w:pPr>
+        <w:pStyle w:val="Heading1"/>
+      </w:pPr>
+      <w:r>
+        <w:t>11. Lead Discovery (Scraping)</w:t>
+      </w:r>
+    </w:p>
+    <w:p>
+      <w:r>
+        <w:t>Modul terpisah (discovery_main.py + folder discovery/) yang mencari lead baru dari internet dan Google Maps, lalu menambahkannya ke sheet CLIENT — tidak mengirim outreach apapun sendiri, hanya menambah data. Diadaptasi dari dua project lama yang sudah dipensiunkan: D:\BOT\pt-ekspor-arang-agent (sistem agent AI lengkap dengan database sendiri) dan D:\BOT\gmaps-leads-scraper (prototype scraper Google Maps).</w:t>
+      </w:r>
+    </w:p>
+    <w:p>
+      <w:pPr>
+        <w:pStyle w:val="Heading2"/>
+      </w:pPr>
+      <w:r>
+        <w:t>11.1 Sumber Data</w:t>
+      </w:r>
+    </w:p>
+    <w:tbl>
+      <w:tblPr>
+        <w:tblStyle w:val="LightGrid-Accent1"/>
+        <w:tblW w:type="auto" w:w="0"/>
+        <w:tblLook w:firstColumn="1" w:firstRow="1" w:lastColumn="0" w:lastRow="0" w:noHBand="0" w:noVBand="1" w:val="04A0"/>
+      </w:tblPr>
+      <w:tblGrid>
+        <w:gridCol w:w="2880"/>
+        <w:gridCol w:w="2880"/>
+        <w:gridCol w:w="2880"/>
+      </w:tblGrid>
+      <w:tr>
+        <w:tc>
+          <w:tcPr>
+            <w:tcW w:type="dxa" w:w="2880"/>
+          </w:tcPr>
+          <w:p>
+            <w:r>
+              <w:t>Sumber</w:t>
+            </w:r>
+          </w:p>
+        </w:tc>
+        <w:tc>
+          <w:tcPr>
+            <w:tcW w:type="dxa" w:w="2880"/>
+          </w:tcPr>
+          <w:p>
+            <w:r>
+              <w:t>File</w:t>
+            </w:r>
+          </w:p>
+        </w:tc>
+        <w:tc>
+          <w:tcPr>
+            <w:tcW w:type="dxa" w:w="2880"/>
+          </w:tcPr>
+          <w:p>
+            <w:r>
+              <w:t>Status &amp; Catatan</w:t>
+            </w:r>
+          </w:p>
+        </w:tc>
+      </w:tr>
+      <w:tr>
+        <w:tc>
+          <w:tcPr>
+            <w:tcW w:type="dxa" w:w="2880"/>
+          </w:tcPr>
+          <w:p>
+            <w:r>
+              <w:t>Google Maps shared list</w:t>
+            </w:r>
+          </w:p>
+        </w:tc>
+        <w:tc>
+          <w:tcPr>
+            <w:tcW w:type="dxa" w:w="2880"/>
+          </w:tcPr>
+          <w:p>
+            <w:r>
+              <w:t>discovery/gmaps_scraper.py</w:t>
+            </w:r>
+          </w:p>
+        </w:tc>
+        <w:tc>
+          <w:tcPr>
+            <w:tcW w:type="dxa" w:w="2880"/>
+          </w:tcPr>
+          <w:p>
+            <w:r>
+              <w:t>Sumber paling reliable — terbukti jalan. Membutuhkan link Google Maps shared list (bukan link pencarian biasa) dari user via GMAPS_LIST_URLS, karena Google Maps tidak punya API publik untuk pencarian otomatis lintas negara.</w:t>
+            </w:r>
+          </w:p>
+        </w:tc>
+      </w:tr>
+      <w:tr>
+        <w:tc>
+          <w:tcPr>
+            <w:tcW w:type="dxa" w:w="2880"/>
+          </w:tcPr>
+          <w:p>
+            <w:r>
+              <w:t>Web scraper (TradeIndia/ExportHub/Kompass/Google Search)</w:t>
+            </w:r>
+          </w:p>
+        </w:tc>
+        <w:tc>
+          <w:tcPr>
+            <w:tcW w:type="dxa" w:w="2880"/>
+          </w:tcPr>
+          <w:p>
+            <w:r>
+              <w:t>discovery/web_scraper.py</w:t>
+            </w:r>
+          </w:p>
+        </w:tc>
+        <w:tc>
+          <w:tcPr>
+            <w:tcW w:type="dxa" w:w="2880"/>
+          </w:tcPr>
+          <w:p>
+            <w:r>
+              <w:t>Status per 17 Agustus 2026: KEEMPAT sumber diblokir proteksi anti-bot tingkat infrastruktur (CloudFront WAF di TradeIndia, Cloudflare challenge di ExportHub, blokir di Kompass, CAPTCHA "unusual traffic" di Google Search) — sudah diverifikasi langsung, bukan asumsi. Ini bukan bug kode; headless browser biasa tidak cukup untuk bypass, butuh layanan residential proxy/anti-detect berbayar yang di luar scope sistem gratis ini. Kode tetap disimpan (gagal dengan aman, tidak meng-crash run) untuk kemungkinan dipakai lagi di masa depan.</w:t>
+            </w:r>
+          </w:p>
+        </w:tc>
+      </w:tr>
+    </w:tbl>
+    <w:p>
+      <w:pPr>
+        <w:pStyle w:val="Heading2"/>
+      </w:pPr>
+      <w:r>
+        <w:t>11.2 Alur Proses</w:t>
+      </w:r>
+    </w:p>
+    <w:p>
+      <w:pPr>
+        <w:pStyle w:val="ListNumber"/>
+      </w:pPr>
+      <w:r>
+        <w:t>Jalankan semua scraper yang aktif (web scraper selalu, Google Maps kalau GMAPS_LIST_URLS diisi) — hasilnya list mentah lead per sumber.</w:t>
+      </w:r>
+    </w:p>
+    <w:p>
+      <w:pPr>
+        <w:pStyle w:val="ListNumber"/>
+      </w:pPr>
+      <w:r>
+        <w:t>Dedup dalam batch itu sendiri (lead yang sama muncul dari beberapa sumber/list) — berdasarkan nama perusahaan yang dinormalisasi dan nomor telepon.</w:t>
+      </w:r>
+    </w:p>
+    <w:p>
+      <w:pPr>
+        <w:pStyle w:val="ListNumber"/>
+      </w:pPr>
+      <w:r>
+        <w:t>Baca sheet CLIENT yang sudah ada, bandingkan lead baru terhadap data existing (nama + nomor telepon/WhatsApp) — buang yang sudah pernah ada.</w:t>
+      </w:r>
+    </w:p>
+    <w:p>
+      <w:pPr>
+        <w:pStyle w:val="ListNumber"/>
+      </w:pPr>
+      <w:r>
+        <w:t>Untuk lead baru yang punya website tapi belum ada email: kunjungi homepage + halaman /contact, /contact-us, /about, /about-us, cari alamat email dan nama kontak (pola "Mr./Ms. Nama") lewat regex — best effort, banyak situs bisnis tidak mempublikasikan nama kontak personal. Dibatasi maksimal 60 website per run (_MAX_ENRICH) supaya durasi/biaya run terkendali.</w:t>
+      </w:r>
+    </w:p>
+    <w:p>
+      <w:pPr>
+        <w:pStyle w:val="ListNumber"/>
+      </w:pPr>
+      <w:r>
+        <w:t>Tambahkan lead yang genuinely baru ke akhir sheet CLIENT (kolom No/Company/Country/Contact Person/Phone/WhatsApp/Email terisi; Role dan Product Interest sengaja dikosongkan untuk diisi manual, karena scraping tidak bisa menyimpulkan itu secara akurat).</w:t>
+      </w:r>
+    </w:p>
+    <w:p>
+      <w:pPr>
+        <w:pStyle w:val="Heading2"/>
+      </w:pPr>
+      <w:r>
+        <w:t>11.3 Mode Testing &amp; Penjadwalan</w:t>
+      </w:r>
+    </w:p>
+    <w:p>
+      <w:r>
+        <w:t>DISCOVERY_DRY_RUN=true (default) menampilkan preview lead yang akan ditambahkan tanpa benar-benar menulis ke sheet — penting karena kualitas hasil scraping web belum terverifikasi sepenuhnya (lihat 11.1), jadi default aman mencegah data sampah masuk ke sheet produksi. Dijadwalkan harian (03:00 UTC) via .github/workflows/lead-discovery.yml — jauh lebih jarang dari outreach bot (tiap 30 menit) karena scraping Google Maps via Playwright jauh lebih berat secara komputasi dan datanya tidak berubah secepat itu.</w:t>
+      </w:r>
+    </w:p>
     <w:sectPr>
       <w:pgSz w:w="12240" w:h="15840"/>
       <w:pgMar w:top="1440" w:right="1800" w:bottom="1440" w:left="1800" w:header="720" w:footer="720" w:gutter="0"/>

</xml_diff>

<commit_message>
Document autonomous Google Maps search scraper
</commit_message>
<xml_diff>
--- a/DOCUMENTATION.docx
+++ b/DOCUMENTATION.docx
@@ -1019,6 +1019,29 @@
         <w:t>DISCOVERY_DRY_RUN=true (default) menampilkan preview lead yang akan ditambahkan tanpa benar-benar menulis ke sheet — penting karena kualitas hasil scraping web belum terverifikasi sepenuhnya (lihat 11.1), jadi default aman mencegah data sampah masuk ke sheet produksi. Dijadwalkan harian (03:00 UTC) via .github/workflows/lead-discovery.yml — jauh lebih jarang dari outreach bot (tiap 30 menit) karena scraping Google Maps via Playwright jauh lebih berat secara komputasi dan datanya tidak berubah secepat itu.</w:t>
       </w:r>
     </w:p>
+    <w:p>
+      <w:pPr>
+        <w:pStyle w:val="Heading2"/>
+      </w:pPr>
+      <w:r>
+        <w:t>11.4 Update: Autonomous Google Maps Search (17 Agustus 2026)</w:t>
+      </w:r>
+    </w:p>
+    <w:p>
+      <w:r>
+        <w:t>Ditambahkan discovery/gmaps_search_scraper.py sesuai permintaan user: mencari calon buyer langsung dari Google Maps search (bukan hanya shared list manual), tanpa perlu link apapun dari user. Query seperti "charcoal importer in Turkey" dijalankan langsung terhadap negara-negara pasar ekspor yang relevan (daftar sama dengan country_timezones.py) dikombinasikan dengan beberapa istilah buyer-intent (charcoal importer, wholesaler, bbq charcoal supplier, shisha charcoal distributor).</w:t>
+      </w:r>
+    </w:p>
+    <w:p>
+      <w:r>
+        <w:t>Terverifikasi langsung jalan (bukan asumsi): satu test search "charcoal importer in United Arab Emirates" menghasilkan 8 perusahaan riil lengkap dengan nama, kategori, alamat, nomor telepon, dan website. Setelah dedup terhadap sheet CLIENT yang ada, 2 di antaranya genuinely baru, dan enrichment berhasil menemukan email asli dari website kedua perusahaan tersebut.</w:t>
+      </w:r>
+    </w:p>
+    <w:p>
+      <w:r>
+        <w:t>Cakupan dibatasi 12 kombinasi query x negara per run (MAX_COMBOS_PER_RUN di gmaps_search_scraper.py) supaya durasi run tetap wajar di GitHub Actions - scraping Maps lewat Playwright lambat (tiap kombo bisa 1-3 menit). Kombinasi mana yang diproses berputar otomatis berdasarkan hari (deterministic day-of-year rotation), jadi sapuan penuh seluruh kombinasi (query × negara, totalnya ratusan) selesai bertahap lewat banyak run cron harian, bukan sekaligus - tidak ada data yang "hilang diam-diam", semua kombinasi dapat giliran.</w:t>
+      </w:r>
+    </w:p>
     <w:sectPr>
       <w:pgSz w:w="12240" w:h="15840"/>
       <w:pgMar w:top="1440" w:right="1800" w:bottom="1440" w:left="1800" w:header="720" w:footer="720" w:gutter="0"/>

</xml_diff>

<commit_message>
Update docs for global country coverage and daily recap table
</commit_message>
<xml_diff>
--- a/DOCUMENTATION.docx
+++ b/DOCUMENTATION.docx
@@ -1042,6 +1042,24 @@
         <w:t>Cakupan dibatasi 12 kombinasi query x negara per run (MAX_COMBOS_PER_RUN di gmaps_search_scraper.py) supaya durasi run tetap wajar di GitHub Actions - scraping Maps lewat Playwright lambat (tiap kombo bisa 1-3 menit). Kombinasi mana yang diproses berputar otomatis berdasarkan hari (deterministic day-of-year rotation), jadi sapuan penuh seluruh kombinasi (query × negara, totalnya ratusan) selesai bertahap lewat banyak run cron harian, bukan sekaligus - tidak ada data yang "hilang diam-diam", semua kombinasi dapat giliran.</w:t>
       </w:r>
     </w:p>
+    <w:p>
+      <w:pPr>
+        <w:pStyle w:val="Heading1"/>
+      </w:pPr>
+      <w:r>
+        <w:t>12. Rekap Harian Client Dihubungi (CORE DATABASE)</w:t>
+      </w:r>
+    </w:p>
+    <w:p>
+      <w:r>
+        <w:t>Sejak 17 Agustus 2026, main.py mencatat jumlah client yang berhasil dikirimi offer setiap kali run selesai, lalu melaporkannya ke tabel rekap di tab CORE DATABASE kolom X/Y (area yang sebelumnya kosong, data existing di tab itu cuma sampai kolom V, jadi tidak menimpa apapun). Format tanggal DD/MM/YYYY mengikuti zona waktu WIB (Asia/Jakarta, sama dengan Bogor) sesuai permintaan user, satu baris per hari.</w:t>
+      </w:r>
+    </w:p>
+    <w:p>
+      <w:r>
+        <w:t>Karena cron outreach jalan tiap 30 menit (banyak run per hari), sheet_client.record_daily_contacts() increment angka pada baris tanggal hari itu kalau sudah ada (bukan menimpa), atau membuat baris baru kalau berganti hari. Rekap mulai terhitung dari hari fitur ini diaktifkan (17/08/2026) — data historis sebelum itu tidak direkonstruksi.</w:t>
+      </w:r>
+    </w:p>
     <w:sectPr>
       <w:pgSz w:w="12240" w:h="15840"/>
       <w:pgMar w:top="1440" w:right="1800" w:bottom="1440" w:left="1800" w:header="720" w:footer="720" w:gutter="0"/>

</xml_diff>